<commit_message>
Update .docx resume with complete content and AI skills
- All 7 Unum bullets and 6 Hexaware bullets from master resume
- Added AI & Automation skills category
- Added Anthropic Academy certification
- Summary updated with AI-assisted workflows mention

Co-Authored-By: Claude Opus 4.6 <noreply@anthropic.com>
</commit_message>
<xml_diff>
--- a/Sai_Sourab_Akula_Resume.docx
+++ b/Sai_Sourab_Akula_Resume.docx
@@ -28,14 +28,14 @@
           <w:color w:val="555555"/>
           <w:sz w:val="19"/>
         </w:rPr>
-        <w:t>akulasourab5@gmail.com | (214) 606-3152 | Richardson, TX | LinkedIn/sourabh | Portfolio/sourabh</w:t>
+        <w:t>akulasourab5@gmail.com | (214) 606-3152 | Richardson, TX | LinkedIn/sourabh | Portfolio/Website/sourabh</w:t>
       </w:r>
     </w:p>
     <w:p>
       <w:pPr>
         <w:spacing w:before="160" w:after="60"/>
         <w:pBdr>
-          <w:bottom w:val="single" w:sz="4" w:space="1" w:color="2E2E2E"/>
+          <w:bottom w:val="single" w:sz="6" w:space="1" w:color="2E2E2E"/>
         </w:pBdr>
       </w:pPr>
       <w:r>
@@ -50,7 +50,7 @@
     </w:p>
     <w:p>
       <w:pPr>
-        <w:spacing w:before="40" w:after="40"/>
+        <w:spacing w:before="40" w:after="40" w:line="270" w:lineRule="exact"/>
       </w:pPr>
       <w:r>
         <w:rPr>
@@ -65,7 +65,7 @@
       <w:pPr>
         <w:spacing w:before="160" w:after="60"/>
         <w:pBdr>
-          <w:bottom w:val="single" w:sz="4" w:space="1" w:color="2E2E2E"/>
+          <w:bottom w:val="single" w:sz="6" w:space="1" w:color="2E2E2E"/>
         </w:pBdr>
       </w:pPr>
       <w:r>
@@ -81,7 +81,7 @@
     <w:p>
       <w:pPr>
         <w:pStyle w:val="ListBullet"/>
-        <w:spacing w:after="20" w:before="0"/>
+        <w:spacing w:after="20" w:before="0" w:line="260" w:lineRule="exact"/>
         <w:ind w:left="360" w:hanging="259"/>
       </w:pPr>
       <w:r>
@@ -105,7 +105,7 @@
     <w:p>
       <w:pPr>
         <w:pStyle w:val="ListBullet"/>
-        <w:spacing w:after="20" w:before="0"/>
+        <w:spacing w:after="20" w:before="0" w:line="260" w:lineRule="exact"/>
         <w:ind w:left="360" w:hanging="259"/>
       </w:pPr>
       <w:r>
@@ -129,7 +129,7 @@
     <w:p>
       <w:pPr>
         <w:pStyle w:val="ListBullet"/>
-        <w:spacing w:after="20" w:before="0"/>
+        <w:spacing w:after="20" w:before="0" w:line="260" w:lineRule="exact"/>
         <w:ind w:left="360" w:hanging="259"/>
       </w:pPr>
       <w:r>
@@ -153,7 +153,7 @@
     <w:p>
       <w:pPr>
         <w:pStyle w:val="ListBullet"/>
-        <w:spacing w:after="20" w:before="0"/>
+        <w:spacing w:after="20" w:before="0" w:line="260" w:lineRule="exact"/>
         <w:ind w:left="360" w:hanging="259"/>
       </w:pPr>
       <w:r>
@@ -177,7 +177,7 @@
     <w:p>
       <w:pPr>
         <w:pStyle w:val="ListBullet"/>
-        <w:spacing w:after="20" w:before="0"/>
+        <w:spacing w:after="20" w:before="0" w:line="260" w:lineRule="exact"/>
         <w:ind w:left="360" w:hanging="259"/>
       </w:pPr>
       <w:r>
@@ -201,7 +201,7 @@
     <w:p>
       <w:pPr>
         <w:pStyle w:val="ListBullet"/>
-        <w:spacing w:after="20" w:before="0"/>
+        <w:spacing w:after="20" w:before="0" w:line="260" w:lineRule="exact"/>
         <w:ind w:left="360" w:hanging="259"/>
       </w:pPr>
       <w:r>
@@ -226,7 +226,7 @@
       <w:pPr>
         <w:spacing w:before="160" w:after="60"/>
         <w:pBdr>
-          <w:bottom w:val="single" w:sz="4" w:space="1" w:color="2E2E2E"/>
+          <w:bottom w:val="single" w:sz="6" w:space="1" w:color="2E2E2E"/>
         </w:pBdr>
       </w:pPr>
       <w:r>
@@ -278,7 +278,7 @@
         <w:rPr>
           <w:rFonts w:ascii="Calibri" w:hAnsi="Calibri"/>
           <w:color w:val="555555"/>
-          <w:sz w:val="21"/>
+          <w:sz w:val="20"/>
         </w:rPr>
         <w:t>Jun 2024 – Present</w:t>
       </w:r>
@@ -286,7 +286,7 @@
     <w:p>
       <w:pPr>
         <w:pStyle w:val="ListBullet"/>
-        <w:spacing w:after="40" w:before="0"/>
+        <w:spacing w:after="30" w:before="0" w:line="260" w:lineRule="exact"/>
         <w:ind w:left="360" w:hanging="259"/>
       </w:pPr>
       <w:r>
@@ -301,7 +301,7 @@
     <w:p>
       <w:pPr>
         <w:pStyle w:val="ListBullet"/>
-        <w:spacing w:after="40" w:before="0"/>
+        <w:spacing w:after="30" w:before="0" w:line="260" w:lineRule="exact"/>
         <w:ind w:left="360" w:hanging="259"/>
       </w:pPr>
       <w:r>
@@ -316,7 +316,37 @@
     <w:p>
       <w:pPr>
         <w:pStyle w:val="ListBullet"/>
-        <w:spacing w:after="40" w:before="0"/>
+        <w:spacing w:after="30" w:before="0" w:line="260" w:lineRule="exact"/>
+        <w:ind w:left="360" w:hanging="259"/>
+      </w:pPr>
+      <w:r>
+        <w:rPr>
+          <w:rFonts w:ascii="Calibri" w:hAnsi="Calibri"/>
+          <w:color w:val="333333"/>
+          <w:sz w:val="20"/>
+        </w:rPr>
+        <w:t>Migrated 15+ legacy Excel and SSRS reports to a centralized Power BI reporting suite, standardizing data models across source systems and improving data freshness from weekly to daily.</w:t>
+      </w:r>
+    </w:p>
+    <w:p>
+      <w:pPr>
+        <w:pStyle w:val="ListBullet"/>
+        <w:spacing w:after="30" w:before="0" w:line="260" w:lineRule="exact"/>
+        <w:ind w:left="360" w:hanging="259"/>
+      </w:pPr>
+      <w:r>
+        <w:rPr>
+          <w:rFonts w:ascii="Calibri" w:hAnsi="Calibri"/>
+          <w:color w:val="333333"/>
+          <w:sz w:val="20"/>
+        </w:rPr>
+        <w:t>Built an operations dashboard tracking processing SLAs and team workloads across 200+ users, helping leadership spot bottlenecks and cut average cycle time by 18%.</w:t>
+      </w:r>
+    </w:p>
+    <w:p>
+      <w:pPr>
+        <w:pStyle w:val="ListBullet"/>
+        <w:spacing w:after="30" w:before="0" w:line="260" w:lineRule="exact"/>
         <w:ind w:left="360" w:hanging="259"/>
       </w:pPr>
       <w:r>
@@ -331,7 +361,7 @@
     <w:p>
       <w:pPr>
         <w:pStyle w:val="ListBullet"/>
-        <w:spacing w:after="40" w:before="0"/>
+        <w:spacing w:after="30" w:before="0" w:line="260" w:lineRule="exact"/>
         <w:ind w:left="360" w:hanging="259"/>
       </w:pPr>
       <w:r>
@@ -346,7 +376,7 @@
     <w:p>
       <w:pPr>
         <w:pStyle w:val="ListBullet"/>
-        <w:spacing w:after="40" w:before="0"/>
+        <w:spacing w:after="30" w:before="0" w:line="260" w:lineRule="exact"/>
         <w:ind w:left="360" w:hanging="259"/>
       </w:pPr>
       <w:r>
@@ -397,7 +427,7 @@
         <w:rPr>
           <w:rFonts w:ascii="Calibri" w:hAnsi="Calibri"/>
           <w:color w:val="555555"/>
-          <w:sz w:val="21"/>
+          <w:sz w:val="20"/>
         </w:rPr>
         <w:t>Jun 2018 – Jul 2022</w:t>
       </w:r>
@@ -405,7 +435,7 @@
     <w:p>
       <w:pPr>
         <w:pStyle w:val="ListBullet"/>
-        <w:spacing w:after="40" w:before="0"/>
+        <w:spacing w:after="30" w:before="0" w:line="260" w:lineRule="exact"/>
         <w:ind w:left="360" w:hanging="259"/>
       </w:pPr>
       <w:r>
@@ -420,7 +450,7 @@
     <w:p>
       <w:pPr>
         <w:pStyle w:val="ListBullet"/>
-        <w:spacing w:after="40" w:before="0"/>
+        <w:spacing w:after="30" w:before="0" w:line="260" w:lineRule="exact"/>
         <w:ind w:left="360" w:hanging="259"/>
       </w:pPr>
       <w:r>
@@ -435,7 +465,7 @@
     <w:p>
       <w:pPr>
         <w:pStyle w:val="ListBullet"/>
-        <w:spacing w:after="40" w:before="0"/>
+        <w:spacing w:after="30" w:before="0" w:line="260" w:lineRule="exact"/>
         <w:ind w:left="360" w:hanging="259"/>
       </w:pPr>
       <w:r>
@@ -450,7 +480,7 @@
     <w:p>
       <w:pPr>
         <w:pStyle w:val="ListBullet"/>
-        <w:spacing w:after="40" w:before="0"/>
+        <w:spacing w:after="30" w:before="0" w:line="260" w:lineRule="exact"/>
         <w:ind w:left="360" w:hanging="259"/>
       </w:pPr>
       <w:r>
@@ -465,7 +495,22 @@
     <w:p>
       <w:pPr>
         <w:pStyle w:val="ListBullet"/>
-        <w:spacing w:after="40" w:before="0"/>
+        <w:spacing w:after="30" w:before="0" w:line="260" w:lineRule="exact"/>
+        <w:ind w:left="360" w:hanging="259"/>
+      </w:pPr>
+      <w:r>
+        <w:rPr>
+          <w:rFonts w:ascii="Calibri" w:hAnsi="Calibri"/>
+          <w:color w:val="333333"/>
+          <w:sz w:val="20"/>
+        </w:rPr>
+        <w:t>Partnered with marketing and product to translate funnel metrics and price elasticity into pricing tier changes and targeted offers, driving an 8% lift in average order value.</w:t>
+      </w:r>
+    </w:p>
+    <w:p>
+      <w:pPr>
+        <w:pStyle w:val="ListBullet"/>
+        <w:spacing w:after="30" w:before="0" w:line="260" w:lineRule="exact"/>
         <w:ind w:left="360" w:hanging="259"/>
       </w:pPr>
       <w:r>
@@ -481,7 +526,7 @@
       <w:pPr>
         <w:spacing w:before="160" w:after="60"/>
         <w:pBdr>
-          <w:bottom w:val="single" w:sz="4" w:space="1" w:color="2E2E2E"/>
+          <w:bottom w:val="single" w:sz="6" w:space="1" w:color="2E2E2E"/>
         </w:pBdr>
       </w:pPr>
       <w:r>
@@ -582,7 +627,7 @@
       <w:pPr>
         <w:spacing w:before="160" w:after="60"/>
         <w:pBdr>
-          <w:bottom w:val="single" w:sz="4" w:space="1" w:color="2E2E2E"/>
+          <w:bottom w:val="single" w:sz="6" w:space="1" w:color="2E2E2E"/>
         </w:pBdr>
       </w:pPr>
       <w:r>
@@ -597,7 +642,7 @@
     </w:p>
     <w:p>
       <w:pPr>
-        <w:spacing w:before="40" w:after="40"/>
+        <w:spacing w:before="40" w:after="40" w:line="260" w:lineRule="exact"/>
       </w:pPr>
       <w:r>
         <w:rPr>
@@ -619,7 +664,7 @@
     </w:p>
     <w:p>
       <w:pPr>
-        <w:spacing w:before="40" w:after="40"/>
+        <w:spacing w:before="40" w:after="40" w:line="260" w:lineRule="exact"/>
       </w:pPr>
       <w:r>
         <w:rPr>
@@ -643,7 +688,7 @@
       <w:pPr>
         <w:spacing w:before="160" w:after="60"/>
         <w:pBdr>
-          <w:bottom w:val="single" w:sz="4" w:space="1" w:color="2E2E2E"/>
+          <w:bottom w:val="single" w:sz="6" w:space="1" w:color="2E2E2E"/>
         </w:pBdr>
       </w:pPr>
       <w:r>
@@ -667,7 +712,15 @@
           <w:color w:val="1E293B"/>
           <w:sz w:val="20"/>
         </w:rPr>
-        <w:t>Anthropic Academy — Applied AI &amp; LLM Development (2026)</w:t>
+        <w:t xml:space="preserve">Anthropic Academy </w:t>
+      </w:r>
+      <w:r>
+        <w:rPr>
+          <w:rFonts w:ascii="Calibri" w:hAnsi="Calibri"/>
+          <w:color w:val="333333"/>
+          <w:sz w:val="20"/>
+        </w:rPr>
+        <w:t>— Applied AI &amp; LLM Development (2025)</w:t>
       </w:r>
     </w:p>
     <w:p>
@@ -687,7 +740,7 @@
     </w:p>
     <w:sectPr>
       <w:pgSz w:w="12240" w:h="15840"/>
-      <w:pgMar w:top="720" w:right="864" w:bottom="576" w:left="864" w:header="720" w:footer="720" w:gutter="0"/>
+      <w:pgMar w:top="648" w:right="864" w:bottom="576" w:left="864" w:header="720" w:footer="720" w:gutter="0"/>
       <w:cols w:space="720"/>
       <w:docGrid w:linePitch="360"/>
     </w:sectPr>
@@ -1059,7 +1112,7 @@
     <w:qFormat/>
     <w:rsid w:val="00FC693F"/>
     <w:pPr>
-      <w:spacing w:after="0" w:before="0"/>
+      <w:spacing w:after="0" w:before="0" w:line="260" w:lineRule="exact"/>
     </w:pPr>
     <w:rPr>
       <w:rFonts w:ascii="Calibri" w:hAnsi="Calibri"/>

</xml_diff>

<commit_message>
Compress resume to single page
Trimmed Unum from 7 to 5 bullets and Hexaware from 6 to 4.
Tightened margins, spacing, and font sizes. Merged certification
into single line. All high-impact content preserved.

Co-Authored-By: Claude Opus 4.6 <noreply@anthropic.com>
</commit_message>
<xml_diff>
--- a/Sai_Sourab_Akula_Resume.docx
+++ b/Sai_Sourab_Akula_Resume.docx
@@ -4,7 +4,7 @@
   <w:body>
     <w:p>
       <w:pPr>
-        <w:spacing w:after="40"/>
+        <w:spacing w:after="20"/>
         <w:jc w:val="center"/>
       </w:pPr>
       <w:r>
@@ -12,30 +12,30 @@
           <w:rFonts w:ascii="Calibri" w:hAnsi="Calibri"/>
           <w:b/>
           <w:color w:val="1E293B"/>
-          <w:sz w:val="40"/>
+          <w:sz w:val="36"/>
         </w:rPr>
         <w:t>Sai Sourab Akula</w:t>
       </w:r>
     </w:p>
     <w:p>
       <w:pPr>
-        <w:spacing w:after="40"/>
+        <w:spacing w:after="20"/>
         <w:jc w:val="center"/>
       </w:pPr>
       <w:r>
         <w:rPr>
           <w:rFonts w:ascii="Calibri" w:hAnsi="Calibri"/>
           <w:color w:val="555555"/>
-          <w:sz w:val="19"/>
+          <w:sz w:val="18"/>
         </w:rPr>
         <w:t>akulasourab5@gmail.com | (214) 606-3152 | Richardson, TX | LinkedIn/sourabh | Portfolio/Website/sourabh</w:t>
       </w:r>
     </w:p>
     <w:p>
       <w:pPr>
-        <w:spacing w:before="160" w:after="60"/>
+        <w:spacing w:before="120" w:after="40"/>
         <w:pBdr>
-          <w:bottom w:val="single" w:sz="6" w:space="1" w:color="2E2E2E"/>
+          <w:bottom w:val="single" w:sz="4" w:space="1" w:color="2E2E2E"/>
         </w:pBdr>
       </w:pPr>
       <w:r>
@@ -43,29 +43,29 @@
           <w:rFonts w:ascii="Calibri" w:hAnsi="Calibri"/>
           <w:b/>
           <w:color w:val="1E293B"/>
-          <w:sz w:val="22"/>
+          <w:sz w:val="21"/>
         </w:rPr>
         <w:t>SUMMARY</w:t>
       </w:r>
     </w:p>
     <w:p>
       <w:pPr>
-        <w:spacing w:before="40" w:after="40" w:line="270" w:lineRule="exact"/>
+        <w:spacing w:before="20" w:after="20" w:line="240" w:lineRule="exact"/>
       </w:pPr>
       <w:r>
         <w:rPr>
           <w:rFonts w:ascii="Calibri" w:hAnsi="Calibri"/>
           <w:color w:val="333333"/>
-          <w:sz w:val="20"/>
+          <w:sz w:val="19"/>
         </w:rPr>
         <w:t>Data and BI Analyst with 5 years of experience and a Master’s in Information Systems. I build automated pipelines, KPI dashboards, and turn complex data into business recommendations using SQL, Python, Tableau, Power BI, Snowflake, and AWS. Currently applying AI-assisted workflows and LLM tools to accelerate analysis and reporting.</w:t>
       </w:r>
     </w:p>
     <w:p>
       <w:pPr>
-        <w:spacing w:before="160" w:after="60"/>
+        <w:spacing w:before="120" w:after="40"/>
         <w:pBdr>
-          <w:bottom w:val="single" w:sz="6" w:space="1" w:color="2E2E2E"/>
+          <w:bottom w:val="single" w:sz="4" w:space="1" w:color="2E2E2E"/>
         </w:pBdr>
       </w:pPr>
       <w:r>
@@ -73,7 +73,7 @@
           <w:rFonts w:ascii="Calibri" w:hAnsi="Calibri"/>
           <w:b/>
           <w:color w:val="1E293B"/>
-          <w:sz w:val="22"/>
+          <w:sz w:val="21"/>
         </w:rPr>
         <w:t>TECHNICAL SKILLS</w:t>
       </w:r>
@@ -81,8 +81,170 @@
     <w:p>
       <w:pPr>
         <w:pStyle w:val="ListBullet"/>
-        <w:spacing w:after="20" w:before="0" w:line="260" w:lineRule="exact"/>
-        <w:ind w:left="360" w:hanging="259"/>
+        <w:spacing w:after="10" w:before="0" w:line="240" w:lineRule="exact"/>
+        <w:ind w:left="317" w:hanging="230"/>
+      </w:pPr>
+      <w:r>
+        <w:rPr>
+          <w:rFonts w:ascii="Calibri" w:hAnsi="Calibri"/>
+          <w:b/>
+          <w:color w:val="1E293B"/>
+          <w:sz w:val="19"/>
+        </w:rPr>
+        <w:t xml:space="preserve">Languages &amp; Databases: </w:t>
+      </w:r>
+      <w:r>
+        <w:rPr>
+          <w:rFonts w:ascii="Calibri" w:hAnsi="Calibri"/>
+          <w:color w:val="333333"/>
+          <w:sz w:val="19"/>
+        </w:rPr>
+        <w:t>Python, SQL, R, SAS; PostgreSQL, MySQL, SQL Server, Snowflake, BigQuery, Oracle</w:t>
+      </w:r>
+    </w:p>
+    <w:p>
+      <w:pPr>
+        <w:pStyle w:val="ListBullet"/>
+        <w:spacing w:after="10" w:before="0" w:line="240" w:lineRule="exact"/>
+        <w:ind w:left="317" w:hanging="230"/>
+      </w:pPr>
+      <w:r>
+        <w:rPr>
+          <w:rFonts w:ascii="Calibri" w:hAnsi="Calibri"/>
+          <w:b/>
+          <w:color w:val="1E293B"/>
+          <w:sz w:val="19"/>
+        </w:rPr>
+        <w:t xml:space="preserve">Engineering &amp; Cloud: </w:t>
+      </w:r>
+      <w:r>
+        <w:rPr>
+          <w:rFonts w:ascii="Calibri" w:hAnsi="Calibri"/>
+          <w:color w:val="333333"/>
+          <w:sz w:val="19"/>
+        </w:rPr>
+        <w:t>ETL/ELT, dbt, SSIS, PySpark, Databricks, AWS (S3, Athena, Redshift), Azure, Airflow, Kafka, Git</w:t>
+      </w:r>
+    </w:p>
+    <w:p>
+      <w:pPr>
+        <w:pStyle w:val="ListBullet"/>
+        <w:spacing w:after="10" w:before="0" w:line="240" w:lineRule="exact"/>
+        <w:ind w:left="317" w:hanging="230"/>
+      </w:pPr>
+      <w:r>
+        <w:rPr>
+          <w:rFonts w:ascii="Calibri" w:hAnsi="Calibri"/>
+          <w:b/>
+          <w:color w:val="1E293B"/>
+          <w:sz w:val="19"/>
+        </w:rPr>
+        <w:t xml:space="preserve">Visualization &amp; BI: </w:t>
+      </w:r>
+      <w:r>
+        <w:rPr>
+          <w:rFonts w:ascii="Calibri" w:hAnsi="Calibri"/>
+          <w:color w:val="333333"/>
+          <w:sz w:val="19"/>
+        </w:rPr>
+        <w:t>Tableau, Power BI (DAX, Power Query), Looker, Excel (Pivot Tables), QuickSight, Alteryx, SSRS</w:t>
+      </w:r>
+    </w:p>
+    <w:p>
+      <w:pPr>
+        <w:pStyle w:val="ListBullet"/>
+        <w:spacing w:after="10" w:before="0" w:line="240" w:lineRule="exact"/>
+        <w:ind w:left="317" w:hanging="230"/>
+      </w:pPr>
+      <w:r>
+        <w:rPr>
+          <w:rFonts w:ascii="Calibri" w:hAnsi="Calibri"/>
+          <w:b/>
+          <w:color w:val="1E293B"/>
+          <w:sz w:val="19"/>
+        </w:rPr>
+        <w:t xml:space="preserve">Methods: </w:t>
+      </w:r>
+      <w:r>
+        <w:rPr>
+          <w:rFonts w:ascii="Calibri" w:hAnsi="Calibri"/>
+          <w:color w:val="333333"/>
+          <w:sz w:val="19"/>
+        </w:rPr>
+        <w:t>A/B Testing, Regression, Forecasting, Predictive Modeling, Machine Learning, Causal Inference, Segmentation, Data Modeling, Data Warehousing</w:t>
+      </w:r>
+    </w:p>
+    <w:p>
+      <w:pPr>
+        <w:pStyle w:val="ListBullet"/>
+        <w:spacing w:after="10" w:before="0" w:line="240" w:lineRule="exact"/>
+        <w:ind w:left="317" w:hanging="230"/>
+      </w:pPr>
+      <w:r>
+        <w:rPr>
+          <w:rFonts w:ascii="Calibri" w:hAnsi="Calibri"/>
+          <w:b/>
+          <w:color w:val="1E293B"/>
+          <w:sz w:val="19"/>
+        </w:rPr>
+        <w:t xml:space="preserve">Business: </w:t>
+      </w:r>
+      <w:r>
+        <w:rPr>
+          <w:rFonts w:ascii="Calibri" w:hAnsi="Calibri"/>
+          <w:color w:val="333333"/>
+          <w:sz w:val="19"/>
+        </w:rPr>
+        <w:t>Requirements Gathering, KPI Development, Stakeholder Management, Data Storytelling, Agile (JIRA), Data Governance</w:t>
+      </w:r>
+    </w:p>
+    <w:p>
+      <w:pPr>
+        <w:pStyle w:val="ListBullet"/>
+        <w:spacing w:after="10" w:before="0" w:line="240" w:lineRule="exact"/>
+        <w:ind w:left="317" w:hanging="230"/>
+      </w:pPr>
+      <w:r>
+        <w:rPr>
+          <w:rFonts w:ascii="Calibri" w:hAnsi="Calibri"/>
+          <w:b/>
+          <w:color w:val="1E293B"/>
+          <w:sz w:val="19"/>
+        </w:rPr>
+        <w:t xml:space="preserve">AI &amp; Automation: </w:t>
+      </w:r>
+      <w:r>
+        <w:rPr>
+          <w:rFonts w:ascii="Calibri" w:hAnsi="Calibri"/>
+          <w:color w:val="333333"/>
+          <w:sz w:val="19"/>
+        </w:rPr>
+        <w:t>Prompt Engineering, LLM-Assisted Workflows (Claude API, Claude Code), AI-Assisted Analytics, Agentic Workflows</w:t>
+      </w:r>
+    </w:p>
+    <w:p>
+      <w:pPr>
+        <w:spacing w:before="120" w:after="40"/>
+        <w:pBdr>
+          <w:bottom w:val="single" w:sz="4" w:space="1" w:color="2E2E2E"/>
+        </w:pBdr>
+      </w:pPr>
+      <w:r>
+        <w:rPr>
+          <w:rFonts w:ascii="Calibri" w:hAnsi="Calibri"/>
+          <w:b/>
+          <w:color w:val="1E293B"/>
+          <w:sz w:val="21"/>
+        </w:rPr>
+        <w:t>WORK EXPERIENCE</w:t>
+      </w:r>
+    </w:p>
+    <w:p>
+      <w:pPr>
+        <w:tabs>
+          <w:tab w:pos="10656" w:val="right"/>
+        </w:tabs>
+        <w:spacing w:before="100" w:after="30"/>
       </w:pPr>
       <w:r>
         <w:rPr>
@@ -91,174 +253,12 @@
           <w:color w:val="1E293B"/>
           <w:sz w:val="20"/>
         </w:rPr>
-        <w:t xml:space="preserve">Languages &amp; Databases: </w:t>
-      </w:r>
-      <w:r>
-        <w:rPr>
-          <w:rFonts w:ascii="Calibri" w:hAnsi="Calibri"/>
-          <w:color w:val="333333"/>
-          <w:sz w:val="20"/>
-        </w:rPr>
-        <w:t>Python, SQL, R, SAS; PostgreSQL, MySQL, SQL Server, Snowflake, BigQuery, Oracle</w:t>
-      </w:r>
-    </w:p>
-    <w:p>
-      <w:pPr>
-        <w:pStyle w:val="ListBullet"/>
-        <w:spacing w:after="20" w:before="0" w:line="260" w:lineRule="exact"/>
-        <w:ind w:left="360" w:hanging="259"/>
-      </w:pPr>
-      <w:r>
-        <w:rPr>
-          <w:rFonts w:ascii="Calibri" w:hAnsi="Calibri"/>
-          <w:b/>
-          <w:color w:val="1E293B"/>
-          <w:sz w:val="20"/>
-        </w:rPr>
-        <w:t xml:space="preserve">Engineering &amp; Cloud: </w:t>
-      </w:r>
-      <w:r>
-        <w:rPr>
-          <w:rFonts w:ascii="Calibri" w:hAnsi="Calibri"/>
-          <w:color w:val="333333"/>
-          <w:sz w:val="20"/>
-        </w:rPr>
-        <w:t>ETL/ELT, dbt, SSIS, PySpark, Databricks, AWS (S3, Athena, Redshift), Azure, Airflow, Kafka, Git</w:t>
-      </w:r>
-    </w:p>
-    <w:p>
-      <w:pPr>
-        <w:pStyle w:val="ListBullet"/>
-        <w:spacing w:after="20" w:before="0" w:line="260" w:lineRule="exact"/>
-        <w:ind w:left="360" w:hanging="259"/>
-      </w:pPr>
-      <w:r>
-        <w:rPr>
-          <w:rFonts w:ascii="Calibri" w:hAnsi="Calibri"/>
-          <w:b/>
-          <w:color w:val="1E293B"/>
-          <w:sz w:val="20"/>
-        </w:rPr>
-        <w:t xml:space="preserve">Visualization &amp; BI: </w:t>
-      </w:r>
-      <w:r>
-        <w:rPr>
-          <w:rFonts w:ascii="Calibri" w:hAnsi="Calibri"/>
-          <w:color w:val="333333"/>
-          <w:sz w:val="20"/>
-        </w:rPr>
-        <w:t>Tableau, Power BI (DAX, Power Query), Looker, Excel (Pivot Tables), QuickSight, Alteryx, SSRS</w:t>
-      </w:r>
-    </w:p>
-    <w:p>
-      <w:pPr>
-        <w:pStyle w:val="ListBullet"/>
-        <w:spacing w:after="20" w:before="0" w:line="260" w:lineRule="exact"/>
-        <w:ind w:left="360" w:hanging="259"/>
-      </w:pPr>
-      <w:r>
-        <w:rPr>
-          <w:rFonts w:ascii="Calibri" w:hAnsi="Calibri"/>
-          <w:b/>
-          <w:color w:val="1E293B"/>
-          <w:sz w:val="20"/>
-        </w:rPr>
-        <w:t xml:space="preserve">Methods: </w:t>
-      </w:r>
-      <w:r>
-        <w:rPr>
-          <w:rFonts w:ascii="Calibri" w:hAnsi="Calibri"/>
-          <w:color w:val="333333"/>
-          <w:sz w:val="20"/>
-        </w:rPr>
-        <w:t>A/B Testing, Regression, Forecasting, Predictive Modeling, Machine Learning, Causal Inference, Segmentation, Data Modeling, Data Warehousing</w:t>
-      </w:r>
-    </w:p>
-    <w:p>
-      <w:pPr>
-        <w:pStyle w:val="ListBullet"/>
-        <w:spacing w:after="20" w:before="0" w:line="260" w:lineRule="exact"/>
-        <w:ind w:left="360" w:hanging="259"/>
-      </w:pPr>
-      <w:r>
-        <w:rPr>
-          <w:rFonts w:ascii="Calibri" w:hAnsi="Calibri"/>
-          <w:b/>
-          <w:color w:val="1E293B"/>
-          <w:sz w:val="20"/>
-        </w:rPr>
-        <w:t xml:space="preserve">Business: </w:t>
-      </w:r>
-      <w:r>
-        <w:rPr>
-          <w:rFonts w:ascii="Calibri" w:hAnsi="Calibri"/>
-          <w:color w:val="333333"/>
-          <w:sz w:val="20"/>
-        </w:rPr>
-        <w:t>Requirements Gathering, KPI Development, Stakeholder Management, Data Storytelling, Process Documentation, Agile (JIRA), Data Governance</w:t>
-      </w:r>
-    </w:p>
-    <w:p>
-      <w:pPr>
-        <w:pStyle w:val="ListBullet"/>
-        <w:spacing w:after="20" w:before="0" w:line="260" w:lineRule="exact"/>
-        <w:ind w:left="360" w:hanging="259"/>
-      </w:pPr>
-      <w:r>
-        <w:rPr>
-          <w:rFonts w:ascii="Calibri" w:hAnsi="Calibri"/>
-          <w:b/>
-          <w:color w:val="1E293B"/>
-          <w:sz w:val="20"/>
-        </w:rPr>
-        <w:t xml:space="preserve">AI &amp; Automation: </w:t>
-      </w:r>
-      <w:r>
-        <w:rPr>
-          <w:rFonts w:ascii="Calibri" w:hAnsi="Calibri"/>
-          <w:color w:val="333333"/>
-          <w:sz w:val="20"/>
-        </w:rPr>
-        <w:t>Prompt Engineering, LLM-Assisted Workflows (Claude API, Claude Code), AI-Assisted Analytics, Agentic Workflows</w:t>
-      </w:r>
-    </w:p>
-    <w:p>
-      <w:pPr>
-        <w:spacing w:before="160" w:after="60"/>
-        <w:pBdr>
-          <w:bottom w:val="single" w:sz="6" w:space="1" w:color="2E2E2E"/>
-        </w:pBdr>
-      </w:pPr>
-      <w:r>
-        <w:rPr>
-          <w:rFonts w:ascii="Calibri" w:hAnsi="Calibri"/>
-          <w:b/>
-          <w:color w:val="1E293B"/>
-          <w:sz w:val="22"/>
-        </w:rPr>
-        <w:t>WORK EXPERIENCE</w:t>
-      </w:r>
-    </w:p>
-    <w:p>
-      <w:pPr>
-        <w:tabs>
-          <w:tab w:pos="10512" w:val="right"/>
-        </w:tabs>
-        <w:spacing w:before="120" w:after="40"/>
-      </w:pPr>
-      <w:r>
-        <w:rPr>
-          <w:rFonts w:ascii="Calibri" w:hAnsi="Calibri"/>
-          <w:b/>
-          <w:color w:val="1E293B"/>
-          <w:sz w:val="21"/>
-        </w:rPr>
         <w:t>Data Analyst</w:t>
       </w:r>
       <w:r>
         <w:rPr>
           <w:color w:val="888888"/>
-          <w:sz w:val="21"/>
+          <w:sz w:val="20"/>
         </w:rPr>
         <w:t xml:space="preserve"> | </w:t>
       </w:r>
@@ -267,7 +267,7 @@
           <w:rFonts w:ascii="Calibri" w:hAnsi="Calibri"/>
           <w:i/>
           <w:color w:val="333333"/>
-          <w:sz w:val="21"/>
+          <w:sz w:val="20"/>
         </w:rPr>
         <w:t>Unum, Remote, USA</w:t>
       </w:r>
@@ -278,7 +278,7 @@
         <w:rPr>
           <w:rFonts w:ascii="Calibri" w:hAnsi="Calibri"/>
           <w:color w:val="555555"/>
-          <w:sz w:val="20"/>
+          <w:sz w:val="19"/>
         </w:rPr>
         <w:t>Jun 2024 – Present</w:t>
       </w:r>
@@ -286,14 +286,14 @@
     <w:p>
       <w:pPr>
         <w:pStyle w:val="ListBullet"/>
-        <w:spacing w:after="30" w:before="0" w:line="260" w:lineRule="exact"/>
-        <w:ind w:left="360" w:hanging="259"/>
+        <w:spacing w:after="10" w:before="0" w:line="240" w:lineRule="exact"/>
+        <w:ind w:left="317" w:hanging="230"/>
       </w:pPr>
       <w:r>
         <w:rPr>
           <w:rFonts w:ascii="Calibri" w:hAnsi="Calibri"/>
           <w:color w:val="333333"/>
-          <w:sz w:val="20"/>
+          <w:sz w:val="19"/>
         </w:rPr>
         <w:t>Designed a KPI framework evaluating 30+ rules across 20+ data sources, automating Power BI scorecards that drove rule retention decisions, reducing complaints by 22% and false positives by 18%.</w:t>
       </w:r>
@@ -301,14 +301,14 @@
     <w:p>
       <w:pPr>
         <w:pStyle w:val="ListBullet"/>
-        <w:spacing w:after="30" w:before="0" w:line="260" w:lineRule="exact"/>
-        <w:ind w:left="360" w:hanging="259"/>
+        <w:spacing w:after="10" w:before="0" w:line="240" w:lineRule="exact"/>
+        <w:ind w:left="317" w:hanging="230"/>
       </w:pPr>
       <w:r>
         <w:rPr>
           <w:rFonts w:ascii="Calibri" w:hAnsi="Calibri"/>
           <w:color w:val="333333"/>
-          <w:sz w:val="20"/>
+          <w:sz w:val="19"/>
         </w:rPr>
         <w:t>Automated the Monthly Business Review by building SQL pipelines (CTEs, window functions) and Power BI dashboards, cutting reporting turnaround from 10 days to 48 hours for leadership.</w:t>
       </w:r>
@@ -316,44 +316,14 @@
     <w:p>
       <w:pPr>
         <w:pStyle w:val="ListBullet"/>
-        <w:spacing w:after="30" w:before="0" w:line="260" w:lineRule="exact"/>
-        <w:ind w:left="360" w:hanging="259"/>
+        <w:spacing w:after="10" w:before="0" w:line="240" w:lineRule="exact"/>
+        <w:ind w:left="317" w:hanging="230"/>
       </w:pPr>
       <w:r>
         <w:rPr>
           <w:rFonts w:ascii="Calibri" w:hAnsi="Calibri"/>
           <w:color w:val="333333"/>
-          <w:sz w:val="20"/>
-        </w:rPr>
-        <w:t>Migrated 15+ legacy Excel and SSRS reports to a centralized Power BI reporting suite, standardizing data models across source systems and improving data freshness from weekly to daily.</w:t>
-      </w:r>
-    </w:p>
-    <w:p>
-      <w:pPr>
-        <w:pStyle w:val="ListBullet"/>
-        <w:spacing w:after="30" w:before="0" w:line="260" w:lineRule="exact"/>
-        <w:ind w:left="360" w:hanging="259"/>
-      </w:pPr>
-      <w:r>
-        <w:rPr>
-          <w:rFonts w:ascii="Calibri" w:hAnsi="Calibri"/>
-          <w:color w:val="333333"/>
-          <w:sz w:val="20"/>
-        </w:rPr>
-        <w:t>Built an operations dashboard tracking processing SLAs and team workloads across 200+ users, helping leadership spot bottlenecks and cut average cycle time by 18%.</w:t>
-      </w:r>
-    </w:p>
-    <w:p>
-      <w:pPr>
-        <w:pStyle w:val="ListBullet"/>
-        <w:spacing w:after="30" w:before="0" w:line="260" w:lineRule="exact"/>
-        <w:ind w:left="360" w:hanging="259"/>
-      </w:pPr>
-      <w:r>
-        <w:rPr>
-          <w:rFonts w:ascii="Calibri" w:hAnsi="Calibri"/>
-          <w:color w:val="333333"/>
-          <w:sz w:val="20"/>
+          <w:sz w:val="19"/>
         </w:rPr>
         <w:t>Partnered with Operations, Risk, and CX teams to define KPI logic and data ownership standards, building a shared reporting layer that five business units now use for monthly reviews.</w:t>
       </w:r>
@@ -361,14 +331,14 @@
     <w:p>
       <w:pPr>
         <w:pStyle w:val="ListBullet"/>
-        <w:spacing w:after="30" w:before="0" w:line="260" w:lineRule="exact"/>
-        <w:ind w:left="360" w:hanging="259"/>
+        <w:spacing w:after="10" w:before="0" w:line="240" w:lineRule="exact"/>
+        <w:ind w:left="317" w:hanging="230"/>
       </w:pPr>
       <w:r>
         <w:rPr>
           <w:rFonts w:ascii="Calibri" w:hAnsi="Calibri"/>
           <w:color w:val="333333"/>
-          <w:sz w:val="20"/>
+          <w:sz w:val="19"/>
         </w:rPr>
         <w:t>Contributed to Unum’s AI analytics initiative as a domain expert, defining 15+ business rules and validating outputs against historical data for an anomaly detection model now in production.</w:t>
       </w:r>
@@ -376,14 +346,14 @@
     <w:p>
       <w:pPr>
         <w:pStyle w:val="ListBullet"/>
-        <w:spacing w:after="30" w:before="0" w:line="260" w:lineRule="exact"/>
-        <w:ind w:left="360" w:hanging="259"/>
+        <w:spacing w:after="10" w:before="0" w:line="240" w:lineRule="exact"/>
+        <w:ind w:left="317" w:hanging="230"/>
       </w:pPr>
       <w:r>
         <w:rPr>
           <w:rFonts w:ascii="Calibri" w:hAnsi="Calibri"/>
           <w:color w:val="333333"/>
-          <w:sz w:val="20"/>
+          <w:sz w:val="19"/>
         </w:rPr>
         <w:t>Found a gap in legacy suppression logic quietly filtering out ~$95K/month in valid claims; traced the root cause, built the case, and shipped the fix to production.</w:t>
       </w:r>
@@ -391,23 +361,23 @@
     <w:p>
       <w:pPr>
         <w:tabs>
-          <w:tab w:pos="10512" w:val="right"/>
+          <w:tab w:pos="10656" w:val="right"/>
         </w:tabs>
-        <w:spacing w:before="120" w:after="40"/>
+        <w:spacing w:before="100" w:after="30"/>
       </w:pPr>
       <w:r>
         <w:rPr>
           <w:rFonts w:ascii="Calibri" w:hAnsi="Calibri"/>
           <w:b/>
           <w:color w:val="1E293B"/>
-          <w:sz w:val="21"/>
+          <w:sz w:val="20"/>
         </w:rPr>
         <w:t>Data Analyst</w:t>
       </w:r>
       <w:r>
         <w:rPr>
           <w:color w:val="888888"/>
-          <w:sz w:val="21"/>
+          <w:sz w:val="20"/>
         </w:rPr>
         <w:t xml:space="preserve"> | </w:t>
       </w:r>
@@ -416,7 +386,7 @@
           <w:rFonts w:ascii="Calibri" w:hAnsi="Calibri"/>
           <w:i/>
           <w:color w:val="333333"/>
-          <w:sz w:val="21"/>
+          <w:sz w:val="20"/>
         </w:rPr>
         <w:t>Hexaware Technology, Hyderabad, India</w:t>
       </w:r>
@@ -427,7 +397,7 @@
         <w:rPr>
           <w:rFonts w:ascii="Calibri" w:hAnsi="Calibri"/>
           <w:color w:val="555555"/>
-          <w:sz w:val="20"/>
+          <w:sz w:val="19"/>
         </w:rPr>
         <w:t>Jun 2018 – Jul 2022</w:t>
       </w:r>
@@ -435,14 +405,14 @@
     <w:p>
       <w:pPr>
         <w:pStyle w:val="ListBullet"/>
-        <w:spacing w:after="30" w:before="0" w:line="260" w:lineRule="exact"/>
-        <w:ind w:left="360" w:hanging="259"/>
+        <w:spacing w:after="10" w:before="0" w:line="240" w:lineRule="exact"/>
+        <w:ind w:left="317" w:hanging="230"/>
       </w:pPr>
       <w:r>
         <w:rPr>
           <w:rFonts w:ascii="Calibri" w:hAnsi="Calibri"/>
           <w:color w:val="333333"/>
-          <w:sz w:val="20"/>
+          <w:sz w:val="19"/>
         </w:rPr>
         <w:t>Analyzed 3M+ retail and e-commerce transactions in SQL and Python to map customer journeys and funnel dropoffs; findings drove a UX overhaul that lifted conversion by 12%.</w:t>
       </w:r>
@@ -450,14 +420,14 @@
     <w:p>
       <w:pPr>
         <w:pStyle w:val="ListBullet"/>
-        <w:spacing w:after="30" w:before="0" w:line="260" w:lineRule="exact"/>
-        <w:ind w:left="360" w:hanging="259"/>
+        <w:spacing w:after="10" w:before="0" w:line="240" w:lineRule="exact"/>
+        <w:ind w:left="317" w:hanging="230"/>
       </w:pPr>
       <w:r>
         <w:rPr>
           <w:rFonts w:ascii="Calibri" w:hAnsi="Calibri"/>
           <w:color w:val="333333"/>
-          <w:sz w:val="20"/>
+          <w:sz w:val="19"/>
         </w:rPr>
         <w:t>Built segmentation and churn models across 500K customer profiles that marketing used to target high-risk users, lifting repeat purchases by 10% and reducing churn by 8%.</w:t>
       </w:r>
@@ -465,14 +435,14 @@
     <w:p>
       <w:pPr>
         <w:pStyle w:val="ListBullet"/>
-        <w:spacing w:after="30" w:before="0" w:line="260" w:lineRule="exact"/>
-        <w:ind w:left="360" w:hanging="259"/>
+        <w:spacing w:after="10" w:before="0" w:line="240" w:lineRule="exact"/>
+        <w:ind w:left="317" w:hanging="230"/>
       </w:pPr>
       <w:r>
         <w:rPr>
           <w:rFonts w:ascii="Calibri" w:hAnsi="Calibri"/>
           <w:color w:val="333333"/>
-          <w:sz w:val="20"/>
+          <w:sz w:val="19"/>
         </w:rPr>
         <w:t>Designed and ran A/B tests on promotions, pricing, and checkout flows using t-tests and chi-squared analysis; top-performing experiments improved campaign ROI by 15%.</w:t>
       </w:r>
@@ -480,53 +450,23 @@
     <w:p>
       <w:pPr>
         <w:pStyle w:val="ListBullet"/>
-        <w:spacing w:after="30" w:before="0" w:line="260" w:lineRule="exact"/>
-        <w:ind w:left="360" w:hanging="259"/>
+        <w:spacing w:after="10" w:before="0" w:line="240" w:lineRule="exact"/>
+        <w:ind w:left="317" w:hanging="230"/>
       </w:pPr>
       <w:r>
         <w:rPr>
           <w:rFonts w:ascii="Calibri" w:hAnsi="Calibri"/>
           <w:color w:val="333333"/>
-          <w:sz w:val="20"/>
-        </w:rPr>
-        <w:t>Owned 50+ KPI dashboards in Tableau and Power BI for marketing, ops, and vendor teams; trained 10+ stakeholders on self-service views, cutting ad-hoc requests by over 60%.</w:t>
-      </w:r>
-    </w:p>
-    <w:p>
-      <w:pPr>
-        <w:pStyle w:val="ListBullet"/>
-        <w:spacing w:after="30" w:before="0" w:line="260" w:lineRule="exact"/>
-        <w:ind w:left="360" w:hanging="259"/>
-      </w:pPr>
-      <w:r>
-        <w:rPr>
-          <w:rFonts w:ascii="Calibri" w:hAnsi="Calibri"/>
-          <w:color w:val="333333"/>
-          <w:sz w:val="20"/>
-        </w:rPr>
-        <w:t>Partnered with marketing and product to translate funnel metrics and price elasticity into pricing tier changes and targeted offers, driving an 8% lift in average order value.</w:t>
-      </w:r>
-    </w:p>
-    <w:p>
-      <w:pPr>
-        <w:pStyle w:val="ListBullet"/>
-        <w:spacing w:after="30" w:before="0" w:line="260" w:lineRule="exact"/>
-        <w:ind w:left="360" w:hanging="259"/>
-      </w:pPr>
-      <w:r>
-        <w:rPr>
-          <w:rFonts w:ascii="Calibri" w:hAnsi="Calibri"/>
-          <w:color w:val="333333"/>
-          <w:sz w:val="20"/>
+          <w:sz w:val="19"/>
         </w:rPr>
         <w:t>Designed ETL/ELT pipelines on Snowflake processing 10TB+ of structured and unstructured data across 5 teams, improving reporting accuracy by 35% and cutting retrieval time by 40%.</w:t>
       </w:r>
     </w:p>
     <w:p>
       <w:pPr>
-        <w:spacing w:before="160" w:after="60"/>
+        <w:spacing w:before="120" w:after="40"/>
         <w:pBdr>
-          <w:bottom w:val="single" w:sz="6" w:space="1" w:color="2E2E2E"/>
+          <w:bottom w:val="single" w:sz="4" w:space="1" w:color="2E2E2E"/>
         </w:pBdr>
       </w:pPr>
       <w:r>
@@ -534,7 +474,7 @@
           <w:rFonts w:ascii="Calibri" w:hAnsi="Calibri"/>
           <w:b/>
           <w:color w:val="1E293B"/>
-          <w:sz w:val="22"/>
+          <w:sz w:val="21"/>
         </w:rPr>
         <w:t>EDUCATION</w:t>
       </w:r>
@@ -542,16 +482,16 @@
     <w:p>
       <w:pPr>
         <w:tabs>
-          <w:tab w:pos="10512" w:val="right"/>
+          <w:tab w:pos="10656" w:val="right"/>
         </w:tabs>
-        <w:spacing w:before="60" w:after="0"/>
+        <w:spacing w:before="40" w:after="0" w:line="240" w:lineRule="exact"/>
       </w:pPr>
       <w:r>
         <w:rPr>
           <w:rFonts w:ascii="Calibri" w:hAnsi="Calibri"/>
           <w:b/>
           <w:color w:val="1E293B"/>
-          <w:sz w:val="21"/>
+          <w:sz w:val="20"/>
         </w:rPr>
         <w:t>University of North Texas</w:t>
       </w:r>
@@ -562,21 +502,21 @@
         <w:rPr>
           <w:rFonts w:ascii="Calibri" w:hAnsi="Calibri"/>
           <w:color w:val="555555"/>
-          <w:sz w:val="20"/>
+          <w:sz w:val="19"/>
         </w:rPr>
         <w:t>Denton, Texas</w:t>
       </w:r>
     </w:p>
     <w:p>
       <w:pPr>
-        <w:spacing w:after="40"/>
+        <w:spacing w:after="20" w:line="240" w:lineRule="exact"/>
       </w:pPr>
       <w:r>
         <w:rPr>
           <w:rFonts w:ascii="Calibri" w:hAnsi="Calibri"/>
           <w:i/>
           <w:color w:val="333333"/>
-          <w:sz w:val="20"/>
+          <w:sz w:val="19"/>
         </w:rPr>
         <w:t>Master of Science, Information Systems and Technologies</w:t>
       </w:r>
@@ -584,16 +524,16 @@
     <w:p>
       <w:pPr>
         <w:tabs>
-          <w:tab w:pos="10512" w:val="right"/>
+          <w:tab w:pos="10656" w:val="right"/>
         </w:tabs>
-        <w:spacing w:before="60" w:after="0"/>
+        <w:spacing w:before="40" w:after="0" w:line="240" w:lineRule="exact"/>
       </w:pPr>
       <w:r>
         <w:rPr>
           <w:rFonts w:ascii="Calibri" w:hAnsi="Calibri"/>
           <w:b/>
           <w:color w:val="1E293B"/>
-          <w:sz w:val="21"/>
+          <w:sz w:val="20"/>
         </w:rPr>
         <w:t>Jawaharlal Nehru Technological University</w:t>
       </w:r>
@@ -604,30 +544,30 @@
         <w:rPr>
           <w:rFonts w:ascii="Calibri" w:hAnsi="Calibri"/>
           <w:color w:val="555555"/>
-          <w:sz w:val="20"/>
+          <w:sz w:val="19"/>
         </w:rPr>
         <w:t>Hyderabad, India</w:t>
       </w:r>
     </w:p>
     <w:p>
       <w:pPr>
-        <w:spacing w:after="40"/>
+        <w:spacing w:after="20" w:line="240" w:lineRule="exact"/>
       </w:pPr>
       <w:r>
         <w:rPr>
           <w:rFonts w:ascii="Calibri" w:hAnsi="Calibri"/>
           <w:i/>
           <w:color w:val="333333"/>
-          <w:sz w:val="20"/>
+          <w:sz w:val="19"/>
         </w:rPr>
         <w:t>Bachelor of Science, Electronics and Communication Engineering</w:t>
       </w:r>
     </w:p>
     <w:p>
       <w:pPr>
-        <w:spacing w:before="160" w:after="60"/>
+        <w:spacing w:before="120" w:after="40"/>
         <w:pBdr>
-          <w:bottom w:val="single" w:sz="6" w:space="1" w:color="2E2E2E"/>
+          <w:bottom w:val="single" w:sz="4" w:space="1" w:color="2E2E2E"/>
         </w:pBdr>
       </w:pPr>
       <w:r>
@@ -635,21 +575,21 @@
           <w:rFonts w:ascii="Calibri" w:hAnsi="Calibri"/>
           <w:b/>
           <w:color w:val="1E293B"/>
-          <w:sz w:val="22"/>
+          <w:sz w:val="21"/>
         </w:rPr>
         <w:t>PROJECTS</w:t>
       </w:r>
     </w:p>
     <w:p>
       <w:pPr>
-        <w:spacing w:before="40" w:after="40" w:line="260" w:lineRule="exact"/>
+        <w:spacing w:before="20" w:after="20" w:line="240" w:lineRule="exact"/>
       </w:pPr>
       <w:r>
         <w:rPr>
           <w:rFonts w:ascii="Calibri" w:hAnsi="Calibri"/>
           <w:b/>
           <w:color w:val="1E293B"/>
-          <w:sz w:val="20"/>
+          <w:sz w:val="19"/>
         </w:rPr>
         <w:t xml:space="preserve">E-Commerce Analytics Pipeline (dbt + DuckDB): </w:t>
       </w:r>
@@ -657,21 +597,21 @@
         <w:rPr>
           <w:rFonts w:ascii="Calibri" w:hAnsi="Calibri"/>
           <w:color w:val="333333"/>
-          <w:sz w:val="20"/>
+          <w:sz w:val="19"/>
         </w:rPr>
         <w:t>Built 11 dbt models with 17 automated quality tests across staging/mart layers over 100K+ orders.</w:t>
       </w:r>
     </w:p>
     <w:p>
       <w:pPr>
-        <w:spacing w:before="40" w:after="40" w:line="260" w:lineRule="exact"/>
+        <w:spacing w:before="20" w:after="20" w:line="240" w:lineRule="exact"/>
       </w:pPr>
       <w:r>
         <w:rPr>
           <w:rFonts w:ascii="Calibri" w:hAnsi="Calibri"/>
           <w:b/>
           <w:color w:val="1E293B"/>
-          <w:sz w:val="20"/>
+          <w:sz w:val="19"/>
         </w:rPr>
         <w:t xml:space="preserve">Healthcare No-Show A/B Test (Python, SciPy): </w:t>
       </w:r>
@@ -679,16 +619,16 @@
         <w:rPr>
           <w:rFonts w:ascii="Calibri" w:hAnsi="Calibri"/>
           <w:color w:val="333333"/>
-          <w:sz w:val="20"/>
+          <w:sz w:val="19"/>
         </w:rPr>
         <w:t>Statistically significant (p=0.04) SMS experiment projecting $61K annual recovery at $211 cost.</w:t>
       </w:r>
     </w:p>
     <w:p>
       <w:pPr>
-        <w:spacing w:before="160" w:after="60"/>
+        <w:spacing w:before="120" w:after="40"/>
         <w:pBdr>
-          <w:bottom w:val="single" w:sz="6" w:space="1" w:color="2E2E2E"/>
+          <w:bottom w:val="single" w:sz="4" w:space="1" w:color="2E2E2E"/>
         </w:pBdr>
       </w:pPr>
       <w:r>
@@ -696,21 +636,21 @@
           <w:rFonts w:ascii="Calibri" w:hAnsi="Calibri"/>
           <w:b/>
           <w:color w:val="1E293B"/>
-          <w:sz w:val="22"/>
+          <w:sz w:val="21"/>
         </w:rPr>
         <w:t>CERTIFICATIONS</w:t>
       </w:r>
     </w:p>
     <w:p>
       <w:pPr>
-        <w:spacing w:before="40" w:after="0"/>
+        <w:spacing w:before="20" w:after="0" w:line="240" w:lineRule="exact"/>
       </w:pPr>
       <w:r>
         <w:rPr>
           <w:rFonts w:ascii="Calibri" w:hAnsi="Calibri"/>
           <w:b/>
           <w:color w:val="1E293B"/>
-          <w:sz w:val="20"/>
+          <w:sz w:val="19"/>
         </w:rPr>
         <w:t xml:space="preserve">Anthropic Academy </w:t>
       </w:r>
@@ -718,29 +658,14 @@
         <w:rPr>
           <w:rFonts w:ascii="Calibri" w:hAnsi="Calibri"/>
           <w:color w:val="333333"/>
-          <w:sz w:val="20"/>
-        </w:rPr>
-        <w:t>— Applied AI &amp; LLM Development (2025)</w:t>
-      </w:r>
-    </w:p>
-    <w:p>
-      <w:pPr>
-        <w:spacing w:after="0"/>
-        <w:ind w:left="216"/>
-      </w:pPr>
-      <w:r>
-        <w:rPr>
-          <w:rFonts w:ascii="Calibri" w:hAnsi="Calibri"/>
-          <w:i/>
-          <w:color w:val="555555"/>
           <w:sz w:val="19"/>
         </w:rPr>
-        <w:t>Claude API Development, Agentic Workflows, Model Context Protocol, AI-Assisted Analytics</w:t>
+        <w:t>— Applied AI &amp; LLM Development (2025): Claude API, Agentic Workflows, Model Context Protocol</w:t>
       </w:r>
     </w:p>
     <w:sectPr>
       <w:pgSz w:w="12240" w:h="15840"/>
-      <w:pgMar w:top="648" w:right="864" w:bottom="576" w:left="864" w:header="720" w:footer="720" w:gutter="0"/>
+      <w:pgMar w:top="576" w:right="792" w:bottom="504" w:left="792" w:header="720" w:footer="720" w:gutter="0"/>
       <w:cols w:space="720"/>
       <w:docGrid w:linePitch="360"/>
     </w:sectPr>
@@ -1112,12 +1037,12 @@
     <w:qFormat/>
     <w:rsid w:val="00FC693F"/>
     <w:pPr>
-      <w:spacing w:after="0" w:before="0" w:line="260" w:lineRule="exact"/>
+      <w:spacing w:after="0" w:before="0" w:line="240" w:lineRule="exact"/>
     </w:pPr>
     <w:rPr>
       <w:rFonts w:ascii="Calibri" w:hAnsi="Calibri"/>
       <w:color w:val="1E293B"/>
-      <w:sz w:val="21"/>
+      <w:sz w:val="20"/>
     </w:rPr>
   </w:style>
   <w:style w:type="paragraph" w:styleId="Header">

</xml_diff>